<commit_message>
feat: add newsletter subscription form to footer across multiple pages
- Implemented a newsletter section in the footer of `phototheque.html`, `qui-sommes-nous.html`, `visite-virtuelle.html`, and dynamically generated in `generer.py`.
- Added corresponding styles in `styles.css` for the newsletter form.
- Updated English translations in `en.json` and `en.py` to include newsletter-related text.
- Adjusted footer layout and design credits for consistency across pages.
</commit_message>
<xml_diff>
--- a/docs/Offre_Parc_Expositions_Abidjan_BIG_FIVE_sans_conditions.docx
+++ b/docs/Offre_Parc_Expositions_Abidjan_BIG_FIVE_sans_conditions.docx
@@ -3828,7 +3828,7 @@
       <w:r>
         <w:drawing>
           <wp:inline>
-            <wp:extent cx="1730097" cy="7920000"/>
+            <wp:extent cx="1730097" cy="7965655"/>
             <wp:docPr id="2" name="Picture 2"/>
             <wp:cNvGraphicFramePr>
               <a:graphicFrameLocks noChangeAspect="1"/>
@@ -3849,7 +3849,7 @@
                   <pic:spPr>
                     <a:xfrm>
                       <a:off x="0" y="0"/>
-                      <a:ext cx="1730097" cy="7920000"/>
+                      <a:ext cx="1730097" cy="7965655"/>
                     </a:xfrm>
                     <a:prstGeom prst="rect"/>
                   </pic:spPr>

</xml_diff>